<commit_message>
Updated SQL and Python scripts
</commit_message>
<xml_diff>
--- a/VA Scripts/85_15 Report Scripts for Argos/85_15 Argos VET Codes.docx
+++ b/VA Scripts/85_15 Report Scripts for Argos/85_15 Argos VET Codes.docx
@@ -815,9 +815,10 @@
 </file>
 
 <file path=customXml/item1.xml><?xml version="1.0" encoding="utf-8"?>
-<ct:contentTypeSchema xmlns:ct="http://schemas.microsoft.com/office/2006/metadata/contentType" xmlns:ma="http://schemas.microsoft.com/office/2006/metadata/properties/metaAttributes" ct:_="" ma:_="" ma:contentTypeName="Document" ma:contentTypeID="0x010100623047289ED24B419F67AB721EF265A8" ma:contentTypeVersion="9" ma:contentTypeDescription="Create a new document." ma:contentTypeScope="" ma:versionID="4c8fbc587a4bc4d913414110d4cf554a">
-  <xsd:schema xmlns:xsd="http://www.w3.org/2001/XMLSchema" xmlns:xs="http://www.w3.org/2001/XMLSchema" xmlns:p="http://schemas.microsoft.com/office/2006/metadata/properties" xmlns:ns2="2042da26-2c3a-4b5f-a5a1-c51b944c3949" targetNamespace="http://schemas.microsoft.com/office/2006/metadata/properties" ma:root="true" ma:fieldsID="42eb5b229943cf0a008205fa056571a2" ns2:_="">
+<ct:contentTypeSchema xmlns:ct="http://schemas.microsoft.com/office/2006/metadata/contentType" xmlns:ma="http://schemas.microsoft.com/office/2006/metadata/properties/metaAttributes" ct:_="" ma:_="" ma:contentTypeName="Document" ma:contentTypeID="0x010100623047289ED24B419F67AB721EF265A8" ma:contentTypeVersion="18" ma:contentTypeDescription="Create a new document." ma:contentTypeScope="" ma:versionID="b7b021602d77830a91ae61506c0c0254">
+  <xsd:schema xmlns:xsd="http://www.w3.org/2001/XMLSchema" xmlns:xs="http://www.w3.org/2001/XMLSchema" xmlns:p="http://schemas.microsoft.com/office/2006/metadata/properties" xmlns:ns2="2042da26-2c3a-4b5f-a5a1-c51b944c3949" xmlns:ns3="1fe46bcf-d94e-4efd-a3cd-e669a61993d0" targetNamespace="http://schemas.microsoft.com/office/2006/metadata/properties" ma:root="true" ma:fieldsID="fd7a8d344d7511d87f18a38e0fe2bf2e" ns2:_="" ns3:_="">
     <xsd:import namespace="2042da26-2c3a-4b5f-a5a1-c51b944c3949"/>
+    <xsd:import namespace="1fe46bcf-d94e-4efd-a3cd-e669a61993d0"/>
     <xsd:element name="properties">
       <xsd:complexType>
         <xsd:sequence>
@@ -833,6 +834,14 @@
                 <xsd:element ref="ns2:MediaServiceEventHashCode" minOccurs="0"/>
                 <xsd:element ref="ns2:MediaServiceDateTaken" minOccurs="0"/>
                 <xsd:element ref="ns2:MediaServiceLocation" minOccurs="0"/>
+                <xsd:element ref="ns2:MediaServiceOCR" minOccurs="0"/>
+                <xsd:element ref="ns3:SharedWithUsers" minOccurs="0"/>
+                <xsd:element ref="ns3:SharedWithDetails" minOccurs="0"/>
+                <xsd:element ref="ns2:MediaLengthInSeconds" minOccurs="0"/>
+                <xsd:element ref="ns2:lcf76f155ced4ddcb4097134ff3c332f" minOccurs="0"/>
+                <xsd:element ref="ns3:TaxCatchAll" minOccurs="0"/>
+                <xsd:element ref="ns2:MediaServiceObjectDetectorVersions" minOccurs="0"/>
+                <xsd:element ref="ns2:MediaServiceSearchProperties" minOccurs="0"/>
               </xsd:all>
             </xsd:complexType>
           </xsd:element>
@@ -889,6 +898,76 @@
       <xsd:simpleType>
         <xsd:restriction base="dms:Text"/>
       </xsd:simpleType>
+    </xsd:element>
+    <xsd:element name="MediaServiceOCR" ma:index="17" nillable="true" ma:displayName="Extracted Text" ma:internalName="MediaServiceOCR" ma:readOnly="true">
+      <xsd:simpleType>
+        <xsd:restriction base="dms:Note">
+          <xsd:maxLength value="255"/>
+        </xsd:restriction>
+      </xsd:simpleType>
+    </xsd:element>
+    <xsd:element name="MediaLengthInSeconds" ma:index="20" nillable="true" ma:displayName="MediaLengthInSeconds" ma:hidden="true" ma:internalName="MediaLengthInSeconds" ma:readOnly="true">
+      <xsd:simpleType>
+        <xsd:restriction base="dms:Unknown"/>
+      </xsd:simpleType>
+    </xsd:element>
+    <xsd:element name="lcf76f155ced4ddcb4097134ff3c332f" ma:index="22" nillable="true" ma:taxonomy="true" ma:internalName="lcf76f155ced4ddcb4097134ff3c332f" ma:taxonomyFieldName="MediaServiceImageTags" ma:displayName="Image Tags" ma:readOnly="false" ma:fieldId="{5cf76f15-5ced-4ddc-b409-7134ff3c332f}" ma:taxonomyMulti="true" ma:sspId="7130029f-0b1c-488f-842e-084ea16ff38b" ma:termSetId="09814cd3-568e-fe90-9814-8d621ff8fb84" ma:anchorId="fba54fb3-c3e1-fe81-a776-ca4b69148c4d" ma:open="true" ma:isKeyword="false">
+      <xsd:complexType>
+        <xsd:sequence>
+          <xsd:element ref="pc:Terms" minOccurs="0" maxOccurs="1"/>
+        </xsd:sequence>
+      </xsd:complexType>
+    </xsd:element>
+    <xsd:element name="MediaServiceObjectDetectorVersions" ma:index="24" nillable="true" ma:displayName="MediaServiceObjectDetectorVersions" ma:description="" ma:hidden="true" ma:indexed="true" ma:internalName="MediaServiceObjectDetectorVersions" ma:readOnly="true">
+      <xsd:simpleType>
+        <xsd:restriction base="dms:Text"/>
+      </xsd:simpleType>
+    </xsd:element>
+    <xsd:element name="MediaServiceSearchProperties" ma:index="25" nillable="true" ma:displayName="MediaServiceSearchProperties" ma:hidden="true" ma:internalName="MediaServiceSearchProperties" ma:readOnly="true">
+      <xsd:simpleType>
+        <xsd:restriction base="dms:Note"/>
+      </xsd:simpleType>
+    </xsd:element>
+  </xsd:schema>
+  <xsd:schema xmlns:xsd="http://www.w3.org/2001/XMLSchema" xmlns:xs="http://www.w3.org/2001/XMLSchema" xmlns:dms="http://schemas.microsoft.com/office/2006/documentManagement/types" xmlns:pc="http://schemas.microsoft.com/office/infopath/2007/PartnerControls" targetNamespace="1fe46bcf-d94e-4efd-a3cd-e669a61993d0" elementFormDefault="qualified">
+    <xsd:import namespace="http://schemas.microsoft.com/office/2006/documentManagement/types"/>
+    <xsd:import namespace="http://schemas.microsoft.com/office/infopath/2007/PartnerControls"/>
+    <xsd:element name="SharedWithUsers" ma:index="18" nillable="true" ma:displayName="Shared With" ma:internalName="SharedWithUsers" ma:readOnly="true">
+      <xsd:complexType>
+        <xsd:complexContent>
+          <xsd:extension base="dms:UserMulti">
+            <xsd:sequence>
+              <xsd:element name="UserInfo" minOccurs="0" maxOccurs="unbounded">
+                <xsd:complexType>
+                  <xsd:sequence>
+                    <xsd:element name="DisplayName" type="xsd:string" minOccurs="0"/>
+                    <xsd:element name="AccountId" type="dms:UserId" minOccurs="0" nillable="true"/>
+                    <xsd:element name="AccountType" type="xsd:string" minOccurs="0"/>
+                  </xsd:sequence>
+                </xsd:complexType>
+              </xsd:element>
+            </xsd:sequence>
+          </xsd:extension>
+        </xsd:complexContent>
+      </xsd:complexType>
+    </xsd:element>
+    <xsd:element name="SharedWithDetails" ma:index="19" nillable="true" ma:displayName="Shared With Details" ma:internalName="SharedWithDetails" ma:readOnly="true">
+      <xsd:simpleType>
+        <xsd:restriction base="dms:Note">
+          <xsd:maxLength value="255"/>
+        </xsd:restriction>
+      </xsd:simpleType>
+    </xsd:element>
+    <xsd:element name="TaxCatchAll" ma:index="23" nillable="true" ma:displayName="Taxonomy Catch All Column" ma:hidden="true" ma:list="{080ad9d7-33ff-43c3-b1cd-1a047d27cdb7}" ma:internalName="TaxCatchAll" ma:showField="CatchAllData" ma:web="1fe46bcf-d94e-4efd-a3cd-e669a61993d0">
+      <xsd:complexType>
+        <xsd:complexContent>
+          <xsd:extension base="dms:MultiChoiceLookup">
+            <xsd:sequence>
+              <xsd:element name="Value" type="dms:Lookup" maxOccurs="unbounded" minOccurs="0" nillable="true"/>
+            </xsd:sequence>
+          </xsd:extension>
+        </xsd:complexContent>
+      </xsd:complexType>
     </xsd:element>
   </xsd:schema>
   <xsd:schema xmlns="http://schemas.openxmlformats.org/package/2006/metadata/core-properties" xmlns:xsd="http://www.w3.org/2001/XMLSchema" xmlns:xsi="http://www.w3.org/2001/XMLSchema-instance" xmlns:dc="http://purl.org/dc/elements/1.1/" xmlns:dcterms="http://purl.org/dc/terms/" xmlns:odoc="http://schemas.microsoft.com/internal/obd" targetNamespace="http://schemas.openxmlformats.org/package/2006/metadata/core-properties" elementFormDefault="qualified" attributeFormDefault="unqualified" blockDefault="#all">
@@ -1001,12 +1080,17 @@
 
 <file path=customXml/item3.xml><?xml version="1.0" encoding="utf-8"?>
 <p:properties xmlns:p="http://schemas.microsoft.com/office/2006/metadata/properties" xmlns:xsi="http://www.w3.org/2001/XMLSchema-instance" xmlns:pc="http://schemas.microsoft.com/office/infopath/2007/PartnerControls">
-  <documentManagement/>
+  <documentManagement>
+    <TaxCatchAll xmlns="1fe46bcf-d94e-4efd-a3cd-e669a61993d0" xsi:nil="true"/>
+    <lcf76f155ced4ddcb4097134ff3c332f xmlns="2042da26-2c3a-4b5f-a5a1-c51b944c3949">
+      <Terms xmlns="http://schemas.microsoft.com/office/infopath/2007/PartnerControls"/>
+    </lcf76f155ced4ddcb4097134ff3c332f>
+  </documentManagement>
 </p:properties>
 </file>
 
 <file path=customXml/itemProps1.xml><?xml version="1.0" encoding="utf-8"?>
-<ds:datastoreItem xmlns:ds="http://schemas.openxmlformats.org/officeDocument/2006/customXml" ds:itemID="{7436B6E8-DD5B-4916-9D6F-7B6FC373B610}"/>
+<ds:datastoreItem xmlns:ds="http://schemas.openxmlformats.org/officeDocument/2006/customXml" ds:itemID="{4F27CA34-E98F-4916-9FC2-70E58857936D}"/>
 </file>
 
 <file path=customXml/itemProps2.xml><?xml version="1.0" encoding="utf-8"?>

</xml_diff>